<commit_message>
continuo sviluppo delle classi dao, implementazione delle funzioni dao alla controller, aggiunta di nuovi classi dao, rework alla classe model referto e aggiunta della classe operativa operazione
</commit_message>
<xml_diff>
--- a/documentazione/primoHomework/PROGETTO O.docx
+++ b/documentazione/primoHomework/PROGETTO O.docx
@@ -843,28 +843,35 @@
           <w:i/>
           <w:iCs/>
         </w:rPr>
-        <w:t xml:space="preserve">Classe che, come funzione, deve creare un referto con: il </w:t>
-      </w:r>
-      <w:r>
-        <w:rPr>
-          <w:i/>
-          <w:iCs/>
-        </w:rPr>
-        <w:t>paziente</w:t>
-      </w:r>
-      <w:r>
-        <w:rPr>
-          <w:i/>
-          <w:iCs/>
-        </w:rPr>
-        <w:t xml:space="preserve"> e il suo medico affidatogli, data di entrata e usci</w:t>
-      </w:r>
-      <w:r>
-        <w:rPr>
-          <w:i/>
-          <w:iCs/>
-        </w:rPr>
-        <w:t>ta del paziente, la diagnosi, il trattamento ed infine l’esito finale.</w:t>
+        <w:t>Classe che, come funzione, deve creare un referto con: il paziente e il suo medico affidatogli, data di entrata e uscita del paziente</w:t>
+      </w:r>
+      <w:r>
+        <w:rPr>
+          <w:i/>
+          <w:iCs/>
+        </w:rPr>
+        <w:t xml:space="preserve"> dalla sala operatoria</w:t>
+      </w:r>
+      <w:r>
+        <w:rPr>
+          <w:i/>
+          <w:iCs/>
+        </w:rPr>
+        <w:t>, la diagnosi, il trattamento</w:t>
+      </w:r>
+      <w:r>
+        <w:rPr>
+          <w:i/>
+          <w:iCs/>
+        </w:rPr>
+        <w:t>, altre note</w:t>
+      </w:r>
+      <w:r>
+        <w:rPr>
+          <w:i/>
+          <w:iCs/>
+        </w:rPr>
+        <w:t xml:space="preserve"> ed infine l’esito finale.</w:t>
       </w:r>
     </w:p>
     <w:p>
@@ -880,14 +887,73 @@
     <w:p>
       <w:pPr>
         <w:pStyle w:val="Paragrafoelenco"/>
-        <w:ind w:left="1428"/>
-        <w:rPr>
-          <w:iCs/>
-        </w:rPr>
-      </w:pPr>
+        <w:numPr>
+          <w:ilvl w:val="0"/>
+          <w:numId w:val="2"/>
+        </w:numPr>
+        <w:rPr>
+          <w:i/>
+          <w:iCs/>
+        </w:rPr>
+      </w:pPr>
+      <w:r>
+        <w:rPr>
+          <w:b/>
+          <w:i/>
+          <w:iCs/>
+        </w:rPr>
+        <w:t>Operazione:</w:t>
+      </w:r>
     </w:p>
     <w:p>
       <w:pPr>
+        <w:pStyle w:val="Paragrafoelenco"/>
+        <w:ind w:left="1428"/>
+        <w:rPr>
+          <w:i/>
+          <w:iCs/>
+          <w:u w:val="single"/>
+        </w:rPr>
+      </w:pPr>
+      <w:r>
+        <w:rPr>
+          <w:i/>
+          <w:iCs/>
+        </w:rPr>
+        <w:t>Classe operativa che, come funzione, effettuerà le operazione effettive ai pazienti, dopo l’operazione verrà generato il referto contenente tutte le informazioni relative all’operazione.</w:t>
+      </w:r>
+      <w:bookmarkStart w:id="0" w:name="_GoBack"/>
+      <w:bookmarkEnd w:id="0"/>
+    </w:p>
+    <w:p>
+      <w:pPr>
+        <w:rPr>
+          <w:i/>
+          <w:iCs/>
+        </w:rPr>
+      </w:pPr>
+    </w:p>
+    <w:p>
+      <w:pPr>
+        <w:pStyle w:val="Paragrafoelenco"/>
+        <w:ind w:left="1428"/>
+        <w:rPr>
+          <w:i/>
+          <w:iCs/>
+        </w:rPr>
+      </w:pPr>
+    </w:p>
+    <w:p>
+      <w:pPr>
+        <w:pStyle w:val="Paragrafoelenco"/>
+        <w:ind w:left="1428"/>
+        <w:rPr>
+          <w:iCs/>
+        </w:rPr>
+      </w:pPr>
+    </w:p>
+    <w:p>
+      <w:pPr>
         <w:ind w:left="708"/>
         <w:jc w:val="both"/>
         <w:rPr>
@@ -900,30 +966,41 @@
           <w:i/>
           <w:iCs/>
         </w:rPr>
-        <w:pict w14:anchorId="4279A0AF">
-          <v:shapetype id="_x0000_t75" coordsize="21600,21600" o:spt="75" o:preferrelative="t" path="m@4@5l@4@11@9@11@9@5xe" filled="f" stroked="f">
-            <v:stroke joinstyle="miter"/>
-            <v:formulas>
-              <v:f eqn="if lineDrawn pixelLineWidth 0"/>
-              <v:f eqn="sum @0 1 0"/>
-              <v:f eqn="sum 0 0 @1"/>
-              <v:f eqn="prod @2 1 2"/>
-              <v:f eqn="prod @3 21600 pixelWidth"/>
-              <v:f eqn="prod @3 21600 pixelHeight"/>
-              <v:f eqn="sum @0 0 1"/>
-              <v:f eqn="prod @6 1 2"/>
-              <v:f eqn="prod @7 21600 pixelWidth"/>
-              <v:f eqn="sum @8 21600 0"/>
-              <v:f eqn="prod @7 21600 pixelHeight"/>
-              <v:f eqn="sum @10 21600 0"/>
-            </v:formulas>
-            <v:path o:extrusionok="f" gradientshapeok="t" o:connecttype="rect"/>
-            <o:lock v:ext="edit" aspectratio="t"/>
-          </v:shapetype>
-          <v:shape id="_x0000_i1025" type="#_x0000_t75" style="width:451.2pt;height:436.8pt">
-            <v:imagedata r:id="rId5" o:title="WhatsApp Image 2026-05-27 at 11.48.21"/>
-          </v:shape>
-        </w:pict>
+        <w:drawing>
+          <wp:inline distT="0" distB="0" distL="0" distR="0" wp14:anchorId="5462BF1B" wp14:editId="673219E6">
+            <wp:extent cx="5731510" cy="3967480"/>
+            <wp:effectExtent l="0" t="0" r="2540" b="0"/>
+            <wp:docPr id="2" name="Immagine 2"/>
+            <wp:cNvGraphicFramePr>
+              <a:graphicFrameLocks xmlns:a="http://schemas.openxmlformats.org/drawingml/2006/main" noChangeAspect="1"/>
+            </wp:cNvGraphicFramePr>
+            <a:graphic xmlns:a="http://schemas.openxmlformats.org/drawingml/2006/main">
+              <a:graphicData uri="http://schemas.openxmlformats.org/drawingml/2006/picture">
+                <pic:pic xmlns:pic="http://schemas.openxmlformats.org/drawingml/2006/picture">
+                  <pic:nvPicPr>
+                    <pic:cNvPr id="1" name=""/>
+                    <pic:cNvPicPr/>
+                  </pic:nvPicPr>
+                  <pic:blipFill>
+                    <a:blip r:embed="rId5"/>
+                    <a:stretch>
+                      <a:fillRect/>
+                    </a:stretch>
+                  </pic:blipFill>
+                  <pic:spPr>
+                    <a:xfrm>
+                      <a:off x="0" y="0"/>
+                      <a:ext cx="5731510" cy="3967480"/>
+                    </a:xfrm>
+                    <a:prstGeom prst="rect">
+                      <a:avLst/>
+                    </a:prstGeom>
+                  </pic:spPr>
+                </pic:pic>
+              </a:graphicData>
+            </a:graphic>
+          </wp:inline>
+        </w:drawing>
       </w:r>
     </w:p>
     <w:p>
@@ -978,8 +1055,6 @@
         </w:rPr>
         <w:t>https://github.com/AlexVassallo/Progetto-POO-BD-2025-2026.git</w:t>
       </w:r>
-      <w:bookmarkStart w:id="0" w:name="_GoBack"/>
-      <w:bookmarkEnd w:id="0"/>
     </w:p>
     <w:p>
       <w:pPr>
@@ -1141,7 +1216,7 @@
       <w:lvlText w:val=""/>
       <w:lvlJc w:val="left"/>
       <w:pPr>
-        <w:ind w:left="1428" w:hanging="360"/>
+        <w:ind w:left="2628" w:hanging="360"/>
       </w:pPr>
       <w:rPr>
         <w:rFonts w:ascii="Wingdings" w:hAnsi="Wingdings" w:hint="default"/>
@@ -1153,7 +1228,7 @@
       <w:lvlText w:val="o"/>
       <w:lvlJc w:val="left"/>
       <w:pPr>
-        <w:ind w:left="2148" w:hanging="360"/>
+        <w:ind w:left="3348" w:hanging="360"/>
       </w:pPr>
       <w:rPr>
         <w:rFonts w:ascii="Courier New" w:hAnsi="Courier New" w:hint="default"/>
@@ -1165,7 +1240,7 @@
       <w:lvlText w:val=""/>
       <w:lvlJc w:val="left"/>
       <w:pPr>
-        <w:ind w:left="2868" w:hanging="360"/>
+        <w:ind w:left="4068" w:hanging="360"/>
       </w:pPr>
       <w:rPr>
         <w:rFonts w:ascii="Wingdings" w:hAnsi="Wingdings" w:hint="default"/>
@@ -1177,7 +1252,7 @@
       <w:lvlText w:val=""/>
       <w:lvlJc w:val="left"/>
       <w:pPr>
-        <w:ind w:left="3588" w:hanging="360"/>
+        <w:ind w:left="4788" w:hanging="360"/>
       </w:pPr>
       <w:rPr>
         <w:rFonts w:ascii="Symbol" w:hAnsi="Symbol" w:hint="default"/>
@@ -1189,7 +1264,7 @@
       <w:lvlText w:val="o"/>
       <w:lvlJc w:val="left"/>
       <w:pPr>
-        <w:ind w:left="4308" w:hanging="360"/>
+        <w:ind w:left="5508" w:hanging="360"/>
       </w:pPr>
       <w:rPr>
         <w:rFonts w:ascii="Courier New" w:hAnsi="Courier New" w:hint="default"/>
@@ -1201,7 +1276,7 @@
       <w:lvlText w:val=""/>
       <w:lvlJc w:val="left"/>
       <w:pPr>
-        <w:ind w:left="5028" w:hanging="360"/>
+        <w:ind w:left="6228" w:hanging="360"/>
       </w:pPr>
       <w:rPr>
         <w:rFonts w:ascii="Wingdings" w:hAnsi="Wingdings" w:hint="default"/>
@@ -1213,7 +1288,7 @@
       <w:lvlText w:val=""/>
       <w:lvlJc w:val="left"/>
       <w:pPr>
-        <w:ind w:left="5748" w:hanging="360"/>
+        <w:ind w:left="6948" w:hanging="360"/>
       </w:pPr>
       <w:rPr>
         <w:rFonts w:ascii="Symbol" w:hAnsi="Symbol" w:hint="default"/>
@@ -1225,7 +1300,7 @@
       <w:lvlText w:val="o"/>
       <w:lvlJc w:val="left"/>
       <w:pPr>
-        <w:ind w:left="6468" w:hanging="360"/>
+        <w:ind w:left="7668" w:hanging="360"/>
       </w:pPr>
       <w:rPr>
         <w:rFonts w:ascii="Courier New" w:hAnsi="Courier New" w:hint="default"/>
@@ -1237,7 +1312,7 @@
       <w:lvlText w:val=""/>
       <w:lvlJc w:val="left"/>
       <w:pPr>
-        <w:ind w:left="7188" w:hanging="360"/>
+        <w:ind w:left="8388" w:hanging="360"/>
       </w:pPr>
       <w:rPr>
         <w:rFonts w:ascii="Wingdings" w:hAnsi="Wingdings" w:hint="default"/>

</xml_diff>